<commit_message>
Remove Jonathan test plan markdown guide and update docx
</commit_message>
<xml_diff>
--- a/docs/plan_de_pruebas/parte_jonathan.docx
+++ b/docs/plan_de_pruebas/parte_jonathan.docx
@@ -116,7 +116,7 @@
         <w:rPr>
           <w:b w:val="false"/>
         </w:rPr>
-        <w:t xml:space="preserve"> Urls /userpage y /adminpage</w:t>
+        <w:t xml:space="preserve"> URLs /userpage y /adminpage</w:t>
       </w:r>
     </w:p>
     <w:p>
@@ -1556,41 +1556,51 @@
         <w:rPr>
           <w:b w:val="false"/>
         </w:rPr>
-        <w:t xml:space="preserve"> El paso 1 deberia de retornar un codigo http “201 Created” con id, description y createdAT y en el paso 2 se podria de visualizar el pedido que acababamos de crear</w:t>
-      </w:r>
-    </w:p>
-    <w:p>
-      <w:pPr>
-        <w:pStyle w:val="Normal"/>
-        <w:bidi w:val="0"/>
-        <w:jc w:val="start"/>
-        <w:rPr/>
-      </w:pPr>
-      <w:r>
-        <w:rPr/>
-        <w:tab/>
-        <w:tab/>
-        <w:tab/>
-      </w:r>
-    </w:p>
-    <w:p>
-      <w:pPr>
-        <w:pStyle w:val="Normal"/>
-        <w:bidi w:val="0"/>
-        <w:jc w:val="start"/>
-        <w:rPr/>
-      </w:pPr>
-      <w:r>
-        <w:rPr>
-          <w:b/>
-        </w:rPr>
-        <w:t xml:space="preserve">Resultado </w:t>
-      </w:r>
-      <w:r>
-        <w:rPr>
-          <w:b w:val="false"/>
-        </w:rPr>
-        <w:t xml:space="preserve">Se retornas los codigos http esperados y se crean correctamente los pedidos </w:t>
+        <w:t xml:space="preserve"> El paso 1 deberia de retornar un codigo http “201 Created” con id, description y createdAt y en el paso 2 se podria de visualizar el pedido que acababamos de crear</w:t>
+      </w:r>
+    </w:p>
+    <w:p>
+      <w:pPr>
+        <w:pStyle w:val="Normal"/>
+        <w:bidi w:val="0"/>
+        <w:jc w:val="start"/>
+        <w:rPr/>
+      </w:pPr>
+      <w:r>
+        <w:rPr/>
+        <w:tab/>
+        <w:tab/>
+        <w:tab/>
+      </w:r>
+    </w:p>
+    <w:p>
+      <w:pPr>
+        <w:pStyle w:val="Normal"/>
+        <w:bidi w:val="0"/>
+        <w:jc w:val="start"/>
+        <w:rPr/>
+      </w:pPr>
+      <w:r>
+        <w:rPr>
+          <w:b/>
+        </w:rPr>
+      </w:r>
+      <w:r>
+        <w:rPr>
+          <w:b w:val="false"/>
+        </w:rPr>
+      </w:r>
+      <w:r>
+        <w:rPr>
+          <w:b/>
+        </w:rPr>
+        <w:t>Resultado obtenido:</w:t>
+      </w:r>
+      <w:r>
+        <w:rPr>
+          <w:b w:val="0"/>
+        </w:rPr>
+        <w:t xml:space="preserve"> Se retornan los codigos http esperados y se crean correctamente los pedidos</w:t>
       </w:r>
     </w:p>
     <w:p>
@@ -2069,41 +2079,51 @@
         <w:rPr>
           <w:b w:val="false"/>
         </w:rPr>
-        <w:t xml:space="preserve"> Ambos pasos deberian de retornar un codigo http “200 OK” y el espacio ‘name’ deberia de coincidir con el enviado en el paso 1</w:t>
-      </w:r>
-    </w:p>
-    <w:p>
-      <w:pPr>
-        <w:pStyle w:val="Normal"/>
-        <w:bidi w:val="0"/>
-        <w:jc w:val="start"/>
-        <w:rPr/>
-      </w:pPr>
-      <w:r>
-        <w:rPr/>
-        <w:tab/>
-        <w:tab/>
-        <w:tab/>
-      </w:r>
-    </w:p>
-    <w:p>
-      <w:pPr>
-        <w:pStyle w:val="Normal"/>
-        <w:bidi w:val="0"/>
-        <w:jc w:val="start"/>
-        <w:rPr/>
-      </w:pPr>
-      <w:r>
-        <w:rPr>
-          <w:b/>
-        </w:rPr>
-        <w:t xml:space="preserve">Resultado </w:t>
-      </w:r>
-      <w:r>
-        <w:rPr>
-          <w:b w:val="false"/>
-        </w:rPr>
-        <w:t>Se retornan los codigos http esperados y el espacio se actualiza y persiste de manera correcta</w:t>
+        <w:t xml:space="preserve"> Ambos pasos deberian de retornar un codigo http “200 OK” y el campo ‘name’ deberia de coincidir con el enviado en el paso 1</w:t>
+      </w:r>
+    </w:p>
+    <w:p>
+      <w:pPr>
+        <w:pStyle w:val="Normal"/>
+        <w:bidi w:val="0"/>
+        <w:jc w:val="start"/>
+        <w:rPr/>
+      </w:pPr>
+      <w:r>
+        <w:rPr/>
+        <w:tab/>
+        <w:tab/>
+        <w:tab/>
+      </w:r>
+    </w:p>
+    <w:p>
+      <w:pPr>
+        <w:pStyle w:val="Normal"/>
+        <w:bidi w:val="0"/>
+        <w:jc w:val="start"/>
+        <w:rPr/>
+      </w:pPr>
+      <w:r>
+        <w:rPr>
+          <w:b/>
+        </w:rPr>
+      </w:r>
+      <w:r>
+        <w:rPr>
+          <w:b w:val="false"/>
+        </w:rPr>
+      </w:r>
+      <w:r>
+        <w:rPr>
+          <w:b/>
+        </w:rPr>
+        <w:t>Resultado obtenido:</w:t>
+      </w:r>
+      <w:r>
+        <w:rPr>
+          <w:b w:val="0"/>
+        </w:rPr>
+        <w:t xml:space="preserve"> Se retornan los codigos http esperados y el campo se actualiza y persiste de manera correcta</w:t>
       </w:r>
     </w:p>
     <w:p>
@@ -2541,13 +2561,23 @@
         <w:rPr>
           <w:b/>
         </w:rPr>
-        <w:t xml:space="preserve">Resultado </w:t>
-      </w:r>
-      <w:r>
-        <w:rPr>
-          <w:b w:val="false"/>
-        </w:rPr>
-        <w:t>Los JSONs de las respuestas incluyen los headers esperados y returna los bodys esperados</w:t>
+      </w:r>
+      <w:r>
+        <w:rPr>
+          <w:b w:val="false"/>
+        </w:rPr>
+      </w:r>
+      <w:r>
+        <w:rPr>
+          <w:b/>
+        </w:rPr>
+        <w:t>Resultado obtenido:</w:t>
+      </w:r>
+      <w:r>
+        <w:rPr>
+          <w:b w:val="0"/>
+        </w:rPr>
+        <w:t xml:space="preserve"> Los JSONs de las respuestas incluyen los headers esperados y retornan los bodys esperados</w:t>
       </w:r>
     </w:p>
     <w:p>
@@ -6517,7 +6547,7 @@
         <w:rPr>
           <w:b w:val="false"/>
         </w:rPr>
-        <w:t xml:space="preserve"> El sistema soporto sin problemas la carga de 50 usuarios concurrentes durante 1 minuto. Las respuestas fueron rapidas (la mayoria por debajo de 320ms) y no hubo ningun error en las casi 5 mil peticiones realizadas, cumpliendo con los limites de tiempo y errores definidos.</w:t>
+        <w:t xml:space="preserve"> El sistema soporto sin problemas la carga de 50 usuarios concurrentes durante 1 minuto. Las respuestas fueron rapidas (la mayoria por debajo de 350ms) y no hubo ningun error en las mas de 4 mil peticiones realizadas, cumpliendo con los limites de tiempo y errores definidos.</w:t>
       </w:r>
     </w:p>
     <w:p>
@@ -7086,7 +7116,7 @@
     <w:pPr>
       <w:widowControl/>
       <w:suppressAutoHyphens w:val="true"/>
-      <w:overflowPunct w:val="true"/>
+      <w:overflowPunct w:val="false"/>
       <w:bidi w:val="0"/>
       <w:spacing w:before="0" w:after="0"/>
       <w:jc w:val="start"/>

</xml_diff>